<commit_message>
Add React frontend (Sprint 3) and update backend/docs
- Complete React + TypeScript frontend: chat UI, chart panel, project view
- Recharts bar/line chart rendering with inline AI responses
- Dark navy/indigo design system, ReactMarkdown message bubbles
- Updated backend/main.py and DataLens use case document

Co-Authored-By: Claude Sonnet 4.6 <noreply@anthropic.com>
</commit_message>
<xml_diff>
--- a/DataLens_UseCase_Document.docx
+++ b/DataLens_UseCase_Document.docx
@@ -7,6 +7,7 @@
       <w:pPr>
         <w:jc w:val="center"/>
       </w:pPr>
+      <w:proofErr w:type="spellStart"/>
       <w:r>
         <w:rPr>
           <w:b/>
@@ -15,6 +16,7 @@
         </w:rPr>
         <w:t>DataLens</w:t>
       </w:r>
+      <w:proofErr w:type="spellEnd"/>
     </w:p>
     <w:p>
       <w:pPr>
@@ -47,11 +49,27 @@
       <w:pPr>
         <w:jc w:val="center"/>
       </w:pPr>
+      <w:proofErr w:type="spellStart"/>
+      <w:proofErr w:type="gramStart"/>
       <w:r>
         <w:rPr>
           <w:color w:val="707070"/>
         </w:rPr>
-        <w:t>BorderlessAccess  |  May 2026</w:t>
+        <w:t>BorderlessAccess</w:t>
+      </w:r>
+      <w:proofErr w:type="spellEnd"/>
+      <w:r>
+        <w:rPr>
+          <w:color w:val="707070"/>
+        </w:rPr>
+        <w:t xml:space="preserve">  |</w:t>
+      </w:r>
+      <w:proofErr w:type="gramEnd"/>
+      <w:r>
+        <w:rPr>
+          <w:color w:val="707070"/>
+        </w:rPr>
+        <w:t xml:space="preserve">  May 2026</w:t>
       </w:r>
     </w:p>
     <w:p>
@@ -72,8 +90,29 @@
       </w:r>
     </w:p>
     <w:p>
+      <w:proofErr w:type="spellStart"/>
       <w:r>
-        <w:t>DataLens is an AI-powered web platform that transforms raw survey data into instant, actionable insights. Designed for BorderlessAccess researchers and clients, DataLens eliminates the dependency on SPSS expertise by allowing users to ask natural language questions and receive data-backed answers, charts, and summaries in seconds.</w:t>
+        <w:t>DataLens</w:t>
+      </w:r>
+      <w:proofErr w:type="spellEnd"/>
+      <w:r>
+        <w:t xml:space="preserve"> is an AI-powered web platform that transforms raw survey data into instant, actionable insights. Designed for </w:t>
+      </w:r>
+      <w:proofErr w:type="spellStart"/>
+      <w:r>
+        <w:t>BorderlessAccess</w:t>
+      </w:r>
+      <w:proofErr w:type="spellEnd"/>
+      <w:r>
+        <w:t xml:space="preserve"> researchers and clients, </w:t>
+      </w:r>
+      <w:proofErr w:type="spellStart"/>
+      <w:r>
+        <w:t>DataLens</w:t>
+      </w:r>
+      <w:proofErr w:type="spellEnd"/>
+      <w:r>
+        <w:t xml:space="preserve"> eliminates the dependency on SPSS expertise by allowing users to ask natural language questions and receive data-backed answers, charts, and summaries in seconds.</w:t>
       </w:r>
     </w:p>
     <w:p>
@@ -151,8 +190,21 @@
       </w:r>
     </w:p>
     <w:p>
+      <w:proofErr w:type="spellStart"/>
       <w:r>
-        <w:t>DataLens ingests SPSS (.sav) survey data along with a structured datamap that describes each variable, its question text, answer options, and type. Once uploaded, the data is immediately available for querying via the AI chatbot, automated summary, or the crosstab builder.</w:t>
+        <w:t>DataLens</w:t>
+      </w:r>
+      <w:proofErr w:type="spellEnd"/>
+      <w:r>
+        <w:t xml:space="preserve"> ingests SPSS (.sav) survey data along with a structured </w:t>
+      </w:r>
+      <w:proofErr w:type="spellStart"/>
+      <w:r>
+        <w:t>datamap</w:t>
+      </w:r>
+      <w:proofErr w:type="spellEnd"/>
+      <w:r>
+        <w:t xml:space="preserve"> that describes each variable, its question text, answer options, and type. Once uploaded, the data is immediately available for querying via the AI chatbot, automated summary, or the crosstab builder.</w:t>
       </w:r>
     </w:p>
     <w:p/>
@@ -179,8 +231,13 @@
       <w:pPr>
         <w:pStyle w:val="ListBullet"/>
       </w:pPr>
+      <w:proofErr w:type="spellStart"/>
       <w:r>
-        <w:t>Datamap: Excel file describing variables, question text, answer options, and weight flag</w:t>
+        <w:t>Datamap</w:t>
+      </w:r>
+      <w:proofErr w:type="spellEnd"/>
+      <w:r>
+        <w:t>: Excel file describing variables, question text, answer options, and weight flag</w:t>
       </w:r>
     </w:p>
     <w:p>
@@ -196,8 +253,13 @@
         <w:pStyle w:val="ListBullet"/>
       </w:pPr>
       <w:r>
-        <w:t>Weighting: weight variable lives inside the SPSS file, flagged in the datamap</w:t>
+        <w:t xml:space="preserve">Weighting: weight variable lives inside the SPSS file, flagged in the </w:t>
       </w:r>
+      <w:proofErr w:type="spellStart"/>
+      <w:r>
+        <w:t>datamap</w:t>
+      </w:r>
+      <w:proofErr w:type="spellEnd"/>
     </w:p>
     <w:p/>
     <w:p>
@@ -388,7 +450,23 @@
     </w:p>
     <w:p>
       <w:r>
-        <w:t>Module 1 is the core of DataLens. Researchers and clients ask natural language questions about survey data and receive instant, accurate answers — complete with a narrative summary, base statement, and visualisation. No SPSS knowledge required.</w:t>
+        <w:t xml:space="preserve">Module 1 is the core of </w:t>
+      </w:r>
+      <w:proofErr w:type="spellStart"/>
+      <w:r>
+        <w:t>DataLens</w:t>
+      </w:r>
+      <w:proofErr w:type="spellEnd"/>
+      <w:r>
+        <w:t xml:space="preserve">. Researchers and clients ask natural language questions about survey data and receive instant, accurate answers — complete with a narrative summary, base statement, and </w:t>
+      </w:r>
+      <w:proofErr w:type="spellStart"/>
+      <w:r>
+        <w:t>visualisation</w:t>
+      </w:r>
+      <w:proofErr w:type="spellEnd"/>
+      <w:r>
+        <w:t>. No SPSS knowledge required.</w:t>
       </w:r>
     </w:p>
     <w:p/>
@@ -408,7 +486,15 @@
         <w:pStyle w:val="ListBullet"/>
       </w:pPr>
       <w:r>
-        <w:t>User types a question in plain English (e.g. "What % of people from UAE heard of AlUla?")</w:t>
+        <w:t xml:space="preserve">User types a question in plain English (e.g. "What % of people from UAE heard of </w:t>
+      </w:r>
+      <w:proofErr w:type="spellStart"/>
+      <w:r>
+        <w:t>AlUla</w:t>
+      </w:r>
+      <w:proofErr w:type="spellEnd"/>
+      <w:r>
+        <w:t>?")</w:t>
       </w:r>
     </w:p>
     <w:p>
@@ -416,8 +502,13 @@
         <w:pStyle w:val="ListBullet"/>
       </w:pPr>
       <w:r>
-        <w:t>Claude AI identifies the relevant SPSS variables using the uploaded datamap</w:t>
+        <w:t xml:space="preserve">Claude AI identifies the relevant SPSS variables using the uploaded </w:t>
       </w:r>
+      <w:proofErr w:type="spellStart"/>
+      <w:r>
+        <w:t>datamap</w:t>
+      </w:r>
+      <w:proofErr w:type="spellEnd"/>
     </w:p>
     <w:p>
       <w:pPr>
@@ -648,7 +739,21 @@
               <w:rPr>
                 <w:sz w:val="20"/>
               </w:rPr>
-              <w:t>What is the top-2 box score for ad likeability?</w:t>
+              <w:t xml:space="preserve">What is the </w:t>
+            </w:r>
+            <w:proofErr w:type="gramStart"/>
+            <w:r>
+              <w:rPr>
+                <w:sz w:val="20"/>
+              </w:rPr>
+              <w:t>top-2</w:t>
+            </w:r>
+            <w:proofErr w:type="gramEnd"/>
+            <w:r>
+              <w:rPr>
+                <w:sz w:val="20"/>
+              </w:rPr>
+              <w:t xml:space="preserve"> box score for ad likeability?</w:t>
             </w:r>
           </w:p>
         </w:tc>
@@ -736,7 +841,21 @@
               <w:rPr>
                 <w:sz w:val="20"/>
               </w:rPr>
-              <w:t>How has awareness of AlUla changed across waves?</w:t>
+              <w:t xml:space="preserve">How has awareness of </w:t>
+            </w:r>
+            <w:proofErr w:type="spellStart"/>
+            <w:r>
+              <w:rPr>
+                <w:sz w:val="20"/>
+              </w:rPr>
+              <w:t>AlUla</w:t>
+            </w:r>
+            <w:proofErr w:type="spellEnd"/>
+            <w:r>
+              <w:rPr>
+                <w:sz w:val="20"/>
+              </w:rPr>
+              <w:t xml:space="preserve"> changed across waves?</w:t>
             </w:r>
           </w:p>
         </w:tc>
@@ -797,7 +916,15 @@
         <w:pStyle w:val="ListBullet"/>
       </w:pPr>
       <w:r>
-        <w:t>What is the top-2 box score for how interesting the advertisement was?</w:t>
+        <w:t xml:space="preserve">What is the </w:t>
+      </w:r>
+      <w:proofErr w:type="gramStart"/>
+      <w:r>
+        <w:t>top-2</w:t>
+      </w:r>
+      <w:proofErr w:type="gramEnd"/>
+      <w:r>
+        <w:t xml:space="preserve"> box score for how interesting the advertisement was?</w:t>
       </w:r>
     </w:p>
     <w:p>
@@ -805,7 +932,15 @@
         <w:pStyle w:val="ListBullet"/>
       </w:pPr>
       <w:r>
-        <w:t>Among respondents with a postgraduate education, which destinations have they visited in the past 3 years?</w:t>
+        <w:t xml:space="preserve">Among respondents with </w:t>
+      </w:r>
+      <w:proofErr w:type="gramStart"/>
+      <w:r>
+        <w:t>a postgraduate</w:t>
+      </w:r>
+      <w:proofErr w:type="gramEnd"/>
+      <w:r>
+        <w:t xml:space="preserve"> education, which destinations have they visited in the past 3 years?</w:t>
       </w:r>
     </w:p>
     <w:p/>
@@ -947,7 +1082,15 @@
         <w:pStyle w:val="ListBullet"/>
       </w:pPr>
       <w:r>
-        <w:t>Claude AI iterates through all questions in the datamap and generates insights for each</w:t>
+        <w:t xml:space="preserve">Claude AI iterates through all questions in the </w:t>
+      </w:r>
+      <w:proofErr w:type="spellStart"/>
+      <w:r>
+        <w:t>datamap</w:t>
+      </w:r>
+      <w:proofErr w:type="spellEnd"/>
+      <w:r>
+        <w:t xml:space="preserve"> and generates insights for each</w:t>
       </w:r>
     </w:p>
     <w:p>
@@ -991,15 +1134,28 @@
         <w:pStyle w:val="ListBullet"/>
       </w:pPr>
       <w:r>
-        <w:t>Quick dataset review — understand the shape of new data immediately after upload</w:t>
+        <w:t xml:space="preserve">Quick dataset review — understand the shape of new data immediately after </w:t>
       </w:r>
+      <w:proofErr w:type="gramStart"/>
+      <w:r>
+        <w:t>upload</w:t>
+      </w:r>
+      <w:proofErr w:type="gramEnd"/>
     </w:p>
     <w:p>
       <w:pPr>
         <w:pStyle w:val="ListBullet"/>
       </w:pPr>
       <w:r>
-        <w:t>Filtered sub-group reporting — rerun summary on any demographic or behavioural segment</w:t>
+        <w:t xml:space="preserve">Filtered sub-group reporting — rerun summary on any demographic or </w:t>
+      </w:r>
+      <w:proofErr w:type="spellStart"/>
+      <w:r>
+        <w:t>behavioural</w:t>
+      </w:r>
+      <w:proofErr w:type="spellEnd"/>
+      <w:r>
+        <w:t xml:space="preserve"> segment</w:t>
       </w:r>
     </w:p>
     <w:p/>
@@ -1556,11 +1712,19 @@
             <w:tcW w:w="3168" w:type="dxa"/>
           </w:tcPr>
           <w:p>
-            <w:r>
-              <w:rPr>
-                <w:sz w:val="20"/>
-              </w:rPr>
-              <w:t>FastAPI (Python)</w:t>
+            <w:proofErr w:type="spellStart"/>
+            <w:r>
+              <w:rPr>
+                <w:sz w:val="20"/>
+              </w:rPr>
+              <w:t>FastAPI</w:t>
+            </w:r>
+            <w:proofErr w:type="spellEnd"/>
+            <w:r>
+              <w:rPr>
+                <w:sz w:val="20"/>
+              </w:rPr>
+              <w:t xml:space="preserve"> (Python)</w:t>
             </w:r>
           </w:p>
         </w:tc>
@@ -1705,8 +1869,16 @@
               <w:rPr>
                 <w:sz w:val="20"/>
               </w:rPr>
-              <w:t>Bar, pie, line chart visualisations</w:t>
-            </w:r>
+              <w:t xml:space="preserve">Bar, pie, line chart </w:t>
+            </w:r>
+            <w:proofErr w:type="spellStart"/>
+            <w:r>
+              <w:rPr>
+                <w:sz w:val="20"/>
+              </w:rPr>
+              <w:t>visualisations</w:t>
+            </w:r>
+            <w:proofErr w:type="spellEnd"/>
           </w:p>
         </w:tc>
       </w:tr>
@@ -1736,7 +1908,21 @@
               <w:rPr>
                 <w:sz w:val="20"/>
               </w:rPr>
-              <w:t>SQL Server (SQLAlchemy)</w:t>
+              <w:t>SQL Server (</w:t>
+            </w:r>
+            <w:proofErr w:type="spellStart"/>
+            <w:r>
+              <w:rPr>
+                <w:sz w:val="20"/>
+              </w:rPr>
+              <w:t>SQLAlchemy</w:t>
+            </w:r>
+            <w:proofErr w:type="spellEnd"/>
+            <w:r>
+              <w:rPr>
+                <w:sz w:val="20"/>
+              </w:rPr>
+              <w:t>)</w:t>
             </w:r>
           </w:p>
         </w:tc>
@@ -1776,11 +1962,19 @@
             <w:tcW w:w="3168" w:type="dxa"/>
           </w:tcPr>
           <w:p>
-            <w:r>
-              <w:rPr>
-                <w:sz w:val="20"/>
-              </w:rPr>
-              <w:t>pyreadstat + pandas</w:t>
+            <w:proofErr w:type="spellStart"/>
+            <w:r>
+              <w:rPr>
+                <w:sz w:val="20"/>
+              </w:rPr>
+              <w:t>pyreadstat</w:t>
+            </w:r>
+            <w:proofErr w:type="spellEnd"/>
+            <w:r>
+              <w:rPr>
+                <w:sz w:val="20"/>
+              </w:rPr>
+              <w:t xml:space="preserve"> + pandas</w:t>
             </w:r>
           </w:p>
         </w:tc>
@@ -1820,11 +2014,19 @@
             <w:tcW w:w="3168" w:type="dxa"/>
           </w:tcPr>
           <w:p>
-            <w:r>
-              <w:rPr>
-                <w:sz w:val="20"/>
-              </w:rPr>
-              <w:t>On-premise server</w:t>
+            <w:proofErr w:type="gramStart"/>
+            <w:r>
+              <w:rPr>
+                <w:sz w:val="20"/>
+              </w:rPr>
+              <w:t>On-premise</w:t>
+            </w:r>
+            <w:proofErr w:type="gramEnd"/>
+            <w:r>
+              <w:rPr>
+                <w:sz w:val="20"/>
+              </w:rPr>
+              <w:t xml:space="preserve"> server</w:t>
             </w:r>
           </w:p>
         </w:tc>
@@ -1863,7 +2065,15 @@
     </w:p>
     <w:p>
       <w:r>
-        <w:t>An important operational requirement for DataLens is the ability to re-upload SPSS data for an existing project without losing any project configuration or chat history. This is a common scenario in market research and must be supported from Day 1.</w:t>
+        <w:t xml:space="preserve">An important operational requirement for </w:t>
+      </w:r>
+      <w:proofErr w:type="spellStart"/>
+      <w:r>
+        <w:t>DataLens</w:t>
+      </w:r>
+      <w:proofErr w:type="spellEnd"/>
+      <w:r>
+        <w:t xml:space="preserve"> is the ability to re-upload SPSS data for an existing project without losing any project configuration or chat history. This is a common scenario in market research and must be supported from Day 1.</w:t>
       </w:r>
     </w:p>
     <w:p/>
@@ -1915,11 +2125,19 @@
       <w:pPr>
         <w:pStyle w:val="Heading2"/>
       </w:pPr>
+      <w:proofErr w:type="gramStart"/>
       <w:r>
         <w:rPr>
           <w:color w:val="1F497D"/>
         </w:rPr>
-        <w:t>How Re-upload Works</w:t>
+        <w:t>How</w:t>
+      </w:r>
+      <w:proofErr w:type="gramEnd"/>
+      <w:r>
+        <w:rPr>
+          <w:color w:val="1F497D"/>
+        </w:rPr>
+        <w:t xml:space="preserve"> Re-upload Works</w:t>
       </w:r>
     </w:p>
     <w:p>
@@ -1927,7 +2145,15 @@
         <w:pStyle w:val="ListBullet"/>
       </w:pPr>
       <w:r>
-        <w:t>Supervisor or Ops uploads a new SPSS file and datamap to the existing project</w:t>
+        <w:t xml:space="preserve">Supervisor or Ops uploads a new SPSS file and </w:t>
+      </w:r>
+      <w:proofErr w:type="spellStart"/>
+      <w:r>
+        <w:t>datamap</w:t>
+      </w:r>
+      <w:proofErr w:type="spellEnd"/>
+      <w:r>
+        <w:t xml:space="preserve"> to the existing project</w:t>
       </w:r>
     </w:p>
     <w:p>
@@ -1968,7 +2194,21 @@
         <w:rPr>
           <w:i/>
         </w:rPr>
-        <w:t>Note: If variable names or question structures change significantly in the revised SPSS file, the datamap must also be updated and re-uploaded alongside the new SPSS file.</w:t>
+        <w:t xml:space="preserve">Note: If variable names or question structures change significantly in the revised SPSS file, the </w:t>
+      </w:r>
+      <w:proofErr w:type="spellStart"/>
+      <w:r>
+        <w:rPr>
+          <w:i/>
+        </w:rPr>
+        <w:t>datamap</w:t>
+      </w:r>
+      <w:proofErr w:type="spellEnd"/>
+      <w:r>
+        <w:rPr>
+          <w:i/>
+        </w:rPr>
+        <w:t xml:space="preserve"> must also be updated and re-uploaded alongside the new SPSS file.</w:t>
       </w:r>
     </w:p>
     <w:p>
@@ -2167,7 +2407,21 @@
               <w:rPr>
                 <w:sz w:val="20"/>
               </w:rPr>
-              <w:t>Full chatbot with real project data. All query types (frequency, top-box, mean, trend). Data re-upload support.</w:t>
+              <w:t xml:space="preserve">Full chatbot with real project data. All query types (frequency, </w:t>
+            </w:r>
+            <w:proofErr w:type="gramStart"/>
+            <w:r>
+              <w:rPr>
+                <w:sz w:val="20"/>
+              </w:rPr>
+              <w:t>top-box</w:t>
+            </w:r>
+            <w:proofErr w:type="gramEnd"/>
+            <w:r>
+              <w:rPr>
+                <w:sz w:val="20"/>
+              </w:rPr>
+              <w:t>, mean, trend). Data re-upload support.</w:t>
             </w:r>
           </w:p>
         </w:tc>
@@ -2268,8 +2522,16 @@
               <w:rPr>
                 <w:sz w:val="20"/>
               </w:rPr>
-              <w:t>UAT &amp; Stabilisation</w:t>
-            </w:r>
+              <w:t xml:space="preserve">UAT &amp; </w:t>
+            </w:r>
+            <w:proofErr w:type="spellStart"/>
+            <w:r>
+              <w:rPr>
+                <w:sz w:val="20"/>
+              </w:rPr>
+              <w:t>Stabilisation</w:t>
+            </w:r>
+            <w:proofErr w:type="spellEnd"/>
           </w:p>
         </w:tc>
         <w:tc>
@@ -2338,7 +2600,21 @@
               <w:rPr>
                 <w:sz w:val="20"/>
               </w:rPr>
-              <w:t>Automated full survey summary. Global filter to rerun on sub-groups. Report export.</w:t>
+              <w:t xml:space="preserve">Automated full survey summary. Global filter to rerun on sub-groups. </w:t>
+            </w:r>
+            <w:proofErr w:type="gramStart"/>
+            <w:r>
+              <w:rPr>
+                <w:sz w:val="20"/>
+              </w:rPr>
+              <w:t>Report</w:t>
+            </w:r>
+            <w:proofErr w:type="gramEnd"/>
+            <w:r>
+              <w:rPr>
+                <w:sz w:val="20"/>
+              </w:rPr>
+              <w:t xml:space="preserve"> export.</w:t>
             </w:r>
           </w:p>
         </w:tc>
@@ -2456,7 +2732,15 @@
     </w:p>
     <w:p>
       <w:r>
-        <w:t>Two resource models are presented below. The appropriate model depends on the organisation's decision to use an external development team or leverage internal resources with domain expertise.</w:t>
+        <w:t xml:space="preserve">Two resource models are presented below. The appropriate model depends on the </w:t>
+      </w:r>
+      <w:proofErr w:type="spellStart"/>
+      <w:r>
+        <w:t>organisation's</w:t>
+      </w:r>
+      <w:proofErr w:type="spellEnd"/>
+      <w:r>
+        <w:t xml:space="preserve"> decision to use an external development team or leverage internal resources with domain expertise.</w:t>
       </w:r>
     </w:p>
     <w:p/>
@@ -2631,7 +2915,21 @@
               <w:rPr>
                 <w:sz w:val="20"/>
               </w:rPr>
-              <w:t>5+ yrs Python (FastAPI) + React/TypeScript. REST APIs, SQL Server, data pipelines.</w:t>
+              <w:t>5+ yrs Python (</w:t>
+            </w:r>
+            <w:proofErr w:type="spellStart"/>
+            <w:r>
+              <w:rPr>
+                <w:sz w:val="20"/>
+              </w:rPr>
+              <w:t>FastAPI</w:t>
+            </w:r>
+            <w:proofErr w:type="spellEnd"/>
+            <w:r>
+              <w:rPr>
+                <w:sz w:val="20"/>
+              </w:rPr>
+              <w:t>) + React/TypeScript. REST APIs, SQL Server, data pipelines.</w:t>
             </w:r>
           </w:p>
         </w:tc>
@@ -2644,8 +2942,16 @@
               <w:rPr>
                 <w:sz w:val="20"/>
               </w:rPr>
-              <w:t>5 wks</w:t>
-            </w:r>
+              <w:t xml:space="preserve">5 </w:t>
+            </w:r>
+            <w:proofErr w:type="spellStart"/>
+            <w:r>
+              <w:rPr>
+                <w:sz w:val="20"/>
+              </w:rPr>
+              <w:t>wks</w:t>
+            </w:r>
+            <w:proofErr w:type="spellEnd"/>
           </w:p>
         </w:tc>
         <w:tc>
@@ -2657,8 +2963,16 @@
               <w:rPr>
                 <w:sz w:val="20"/>
               </w:rPr>
-              <w:t>3 wks</w:t>
-            </w:r>
+              <w:t xml:space="preserve">3 </w:t>
+            </w:r>
+            <w:proofErr w:type="spellStart"/>
+            <w:r>
+              <w:rPr>
+                <w:sz w:val="20"/>
+              </w:rPr>
+              <w:t>wks</w:t>
+            </w:r>
+            <w:proofErr w:type="spellEnd"/>
           </w:p>
         </w:tc>
         <w:tc>
@@ -2670,8 +2984,16 @@
               <w:rPr>
                 <w:sz w:val="20"/>
               </w:rPr>
-              <w:t>4 wks</w:t>
-            </w:r>
+              <w:t xml:space="preserve">4 </w:t>
+            </w:r>
+            <w:proofErr w:type="spellStart"/>
+            <w:r>
+              <w:rPr>
+                <w:sz w:val="20"/>
+              </w:rPr>
+              <w:t>wks</w:t>
+            </w:r>
+            <w:proofErr w:type="spellEnd"/>
           </w:p>
         </w:tc>
         <w:tc>
@@ -2683,8 +3005,16 @@
               <w:rPr>
                 <w:sz w:val="20"/>
               </w:rPr>
-              <w:t>10 wks</w:t>
-            </w:r>
+              <w:t xml:space="preserve">10 </w:t>
+            </w:r>
+            <w:proofErr w:type="spellStart"/>
+            <w:r>
+              <w:rPr>
+                <w:sz w:val="20"/>
+              </w:rPr>
+              <w:t>wks</w:t>
+            </w:r>
+            <w:proofErr w:type="spellEnd"/>
           </w:p>
         </w:tc>
       </w:tr>
@@ -2727,8 +3057,16 @@
               <w:rPr>
                 <w:sz w:val="20"/>
               </w:rPr>
-              <w:t>4 wks</w:t>
-            </w:r>
+              <w:t xml:space="preserve">4 </w:t>
+            </w:r>
+            <w:proofErr w:type="spellStart"/>
+            <w:r>
+              <w:rPr>
+                <w:sz w:val="20"/>
+              </w:rPr>
+              <w:t>wks</w:t>
+            </w:r>
+            <w:proofErr w:type="spellEnd"/>
           </w:p>
         </w:tc>
         <w:tc>
@@ -2740,8 +3078,16 @@
               <w:rPr>
                 <w:sz w:val="20"/>
               </w:rPr>
-              <w:t>1 wk</w:t>
-            </w:r>
+              <w:t xml:space="preserve">1 </w:t>
+            </w:r>
+            <w:proofErr w:type="spellStart"/>
+            <w:r>
+              <w:rPr>
+                <w:sz w:val="20"/>
+              </w:rPr>
+              <w:t>wk</w:t>
+            </w:r>
+            <w:proofErr w:type="spellEnd"/>
           </w:p>
         </w:tc>
         <w:tc>
@@ -2753,8 +3099,16 @@
               <w:rPr>
                 <w:sz w:val="20"/>
               </w:rPr>
-              <w:t>4 wks</w:t>
-            </w:r>
+              <w:t xml:space="preserve">4 </w:t>
+            </w:r>
+            <w:proofErr w:type="spellStart"/>
+            <w:r>
+              <w:rPr>
+                <w:sz w:val="20"/>
+              </w:rPr>
+              <w:t>wks</w:t>
+            </w:r>
+            <w:proofErr w:type="spellEnd"/>
           </w:p>
         </w:tc>
         <w:tc>
@@ -2766,8 +3120,16 @@
               <w:rPr>
                 <w:sz w:val="20"/>
               </w:rPr>
-              <w:t>2 wks</w:t>
-            </w:r>
+              <w:t xml:space="preserve">2 </w:t>
+            </w:r>
+            <w:proofErr w:type="spellStart"/>
+            <w:r>
+              <w:rPr>
+                <w:sz w:val="20"/>
+              </w:rPr>
+              <w:t>wks</w:t>
+            </w:r>
+            <w:proofErr w:type="spellEnd"/>
           </w:p>
         </w:tc>
       </w:tr>
@@ -2797,7 +3159,21 @@
               <w:rPr>
                 <w:sz w:val="20"/>
               </w:rPr>
-              <w:t>API testing (Postman/pytest), UI testing, survey domain awareness for test case design.</w:t>
+              <w:t>API testing (Postman/</w:t>
+            </w:r>
+            <w:proofErr w:type="spellStart"/>
+            <w:r>
+              <w:rPr>
+                <w:sz w:val="20"/>
+              </w:rPr>
+              <w:t>pytest</w:t>
+            </w:r>
+            <w:proofErr w:type="spellEnd"/>
+            <w:r>
+              <w:rPr>
+                <w:sz w:val="20"/>
+              </w:rPr>
+              <w:t>), UI testing, survey domain awareness for test case design.</w:t>
             </w:r>
           </w:p>
         </w:tc>
@@ -2810,8 +3186,16 @@
               <w:rPr>
                 <w:sz w:val="20"/>
               </w:rPr>
-              <w:t>2 wks</w:t>
-            </w:r>
+              <w:t xml:space="preserve">2 </w:t>
+            </w:r>
+            <w:proofErr w:type="spellStart"/>
+            <w:r>
+              <w:rPr>
+                <w:sz w:val="20"/>
+              </w:rPr>
+              <w:t>wks</w:t>
+            </w:r>
+            <w:proofErr w:type="spellEnd"/>
           </w:p>
         </w:tc>
         <w:tc>
@@ -2823,8 +3207,16 @@
               <w:rPr>
                 <w:sz w:val="20"/>
               </w:rPr>
-              <w:t>2 wks</w:t>
-            </w:r>
+              <w:t xml:space="preserve">2 </w:t>
+            </w:r>
+            <w:proofErr w:type="spellStart"/>
+            <w:r>
+              <w:rPr>
+                <w:sz w:val="20"/>
+              </w:rPr>
+              <w:t>wks</w:t>
+            </w:r>
+            <w:proofErr w:type="spellEnd"/>
           </w:p>
         </w:tc>
         <w:tc>
@@ -2836,8 +3228,16 @@
               <w:rPr>
                 <w:sz w:val="20"/>
               </w:rPr>
-              <w:t>2 wks</w:t>
-            </w:r>
+              <w:t xml:space="preserve">2 </w:t>
+            </w:r>
+            <w:proofErr w:type="spellStart"/>
+            <w:r>
+              <w:rPr>
+                <w:sz w:val="20"/>
+              </w:rPr>
+              <w:t>wks</w:t>
+            </w:r>
+            <w:proofErr w:type="spellEnd"/>
           </w:p>
         </w:tc>
         <w:tc>
@@ -2849,8 +3249,16 @@
               <w:rPr>
                 <w:sz w:val="20"/>
               </w:rPr>
-              <w:t>4 wks</w:t>
-            </w:r>
+              <w:t xml:space="preserve">4 </w:t>
+            </w:r>
+            <w:proofErr w:type="spellStart"/>
+            <w:r>
+              <w:rPr>
+                <w:sz w:val="20"/>
+              </w:rPr>
+              <w:t>wks</w:t>
+            </w:r>
+            <w:proofErr w:type="spellEnd"/>
           </w:p>
         </w:tc>
       </w:tr>
@@ -3111,7 +3519,21 @@
               <w:rPr>
                 <w:sz w:val="20"/>
               </w:rPr>
-              <w:t>Prepares SPSS files and datamaps, validates variable structures, tests re-upload scenarios</w:t>
+              <w:t xml:space="preserve">Prepares SPSS files and </w:t>
+            </w:r>
+            <w:proofErr w:type="spellStart"/>
+            <w:r>
+              <w:rPr>
+                <w:sz w:val="20"/>
+              </w:rPr>
+              <w:t>datamaps</w:t>
+            </w:r>
+            <w:proofErr w:type="spellEnd"/>
+            <w:r>
+              <w:rPr>
+                <w:sz w:val="20"/>
+              </w:rPr>
+              <w:t>, validates variable structures, tests re-upload scenarios</w:t>
             </w:r>
           </w:p>
         </w:tc>
@@ -3155,7 +3577,21 @@
               <w:rPr>
                 <w:sz w:val="20"/>
               </w:rPr>
-              <w:t>Reviews features at each sprint, signs off UAT, sets module priorities</w:t>
+              <w:t xml:space="preserve">Reviews </w:t>
+            </w:r>
+            <w:proofErr w:type="gramStart"/>
+            <w:r>
+              <w:rPr>
+                <w:sz w:val="20"/>
+              </w:rPr>
+              <w:t>features</w:t>
+            </w:r>
+            <w:proofErr w:type="gramEnd"/>
+            <w:r>
+              <w:rPr>
+                <w:sz w:val="20"/>
+              </w:rPr>
+              <w:t xml:space="preserve"> at each sprint, signs off UAT, sets module priorities</w:t>
             </w:r>
           </w:p>
         </w:tc>
@@ -3638,8 +4074,13 @@
       </w:r>
     </w:p>
     <w:p>
+      <w:proofErr w:type="spellStart"/>
       <w:r>
-        <w:t>DataLens uses Claude claude-sonnet-4-6 via the Anthropic API. Cost is pay-per-use based on tokens processed. Estimates below assume typical survey question complexity.</w:t>
+        <w:t>DataLens</w:t>
+      </w:r>
+      <w:proofErr w:type="spellEnd"/>
+      <w:r>
+        <w:t xml:space="preserve"> uses Claude claude-sonnet-4-6 via the Anthropic API. Cost is pay-per-use based on tokens processed. Estimates below assume typical survey question complexity.</w:t>
       </w:r>
     </w:p>
     <w:p/>
@@ -4008,11 +4449,19 @@
             <w:tcW w:w="3456" w:type="dxa"/>
           </w:tcPr>
           <w:p>
-            <w:r>
-              <w:rPr>
-                <w:sz w:val="20"/>
-              </w:rPr>
-              <w:t>On-premise application server</w:t>
+            <w:proofErr w:type="gramStart"/>
+            <w:r>
+              <w:rPr>
+                <w:sz w:val="20"/>
+              </w:rPr>
+              <w:t>On-premise</w:t>
+            </w:r>
+            <w:proofErr w:type="gramEnd"/>
+            <w:r>
+              <w:rPr>
+                <w:sz w:val="20"/>
+              </w:rPr>
+              <w:t xml:space="preserve"> application server</w:t>
             </w:r>
           </w:p>
         </w:tc>
@@ -4273,7 +4722,21 @@
               <w:rPr>
                 <w:sz w:val="20"/>
               </w:rPr>
-              <w:t>Python, FastAPI, React, Recharts</w:t>
+              <w:t xml:space="preserve">Python, </w:t>
+            </w:r>
+            <w:proofErr w:type="spellStart"/>
+            <w:r>
+              <w:rPr>
+                <w:sz w:val="20"/>
+              </w:rPr>
+              <w:t>FastAPI</w:t>
+            </w:r>
+            <w:proofErr w:type="spellEnd"/>
+            <w:r>
+              <w:rPr>
+                <w:sz w:val="20"/>
+              </w:rPr>
+              <w:t>, React, Recharts</w:t>
             </w:r>
           </w:p>
         </w:tc>
@@ -4357,11 +4820,19 @@
             <w:tcW w:w="3456" w:type="dxa"/>
           </w:tcPr>
           <w:p>
-            <w:r>
-              <w:rPr>
-                <w:sz w:val="20"/>
-              </w:rPr>
-              <w:t>pyreadstat (SPSS parsing)</w:t>
+            <w:proofErr w:type="spellStart"/>
+            <w:r>
+              <w:rPr>
+                <w:sz w:val="20"/>
+              </w:rPr>
+              <w:t>pyreadstat</w:t>
+            </w:r>
+            <w:proofErr w:type="spellEnd"/>
+            <w:r>
+              <w:rPr>
+                <w:sz w:val="20"/>
+              </w:rPr>
+              <w:t xml:space="preserve"> (SPSS parsing)</w:t>
             </w:r>
           </w:p>
         </w:tc>
@@ -4387,7 +4858,21 @@
               <w:rPr>
                 <w:sz w:val="20"/>
               </w:rPr>
-              <w:t>No SPSS licence required on the server</w:t>
+              <w:t xml:space="preserve">No SPSS </w:t>
+            </w:r>
+            <w:proofErr w:type="spellStart"/>
+            <w:r>
+              <w:rPr>
+                <w:sz w:val="20"/>
+              </w:rPr>
+              <w:t>licence</w:t>
+            </w:r>
+            <w:proofErr w:type="spellEnd"/>
+            <w:r>
+              <w:rPr>
+                <w:sz w:val="20"/>
+              </w:rPr>
+              <w:t xml:space="preserve"> required on the server</w:t>
             </w:r>
           </w:p>
         </w:tc>
@@ -4431,7 +4916,21 @@
               <w:rPr>
                 <w:sz w:val="20"/>
               </w:rPr>
-              <w:t>Using existing BorderlessAccess SQL Server instance</w:t>
+              <w:t xml:space="preserve">Using existing </w:t>
+            </w:r>
+            <w:proofErr w:type="spellStart"/>
+            <w:r>
+              <w:rPr>
+                <w:sz w:val="20"/>
+              </w:rPr>
+              <w:t>BorderlessAccess</w:t>
+            </w:r>
+            <w:proofErr w:type="spellEnd"/>
+            <w:r>
+              <w:rPr>
+                <w:sz w:val="20"/>
+              </w:rPr>
+              <w:t xml:space="preserve"> SQL Server instance</w:t>
             </w:r>
           </w:p>
         </w:tc>
@@ -4723,8 +5222,16 @@
               <w:rPr>
                 <w:sz w:val="20"/>
               </w:rPr>
-              <w:t>$2,000–$5,000 or $150–$400/mo</w:t>
-            </w:r>
+              <w:t>$2,000–$5,000 or $150–$400/</w:t>
+            </w:r>
+            <w:proofErr w:type="spellStart"/>
+            <w:r>
+              <w:rPr>
+                <w:sz w:val="20"/>
+              </w:rPr>
+              <w:t>mo</w:t>
+            </w:r>
+            <w:proofErr w:type="spellEnd"/>
           </w:p>
         </w:tc>
         <w:tc>
@@ -4837,7 +5344,19 @@
         <w:rPr>
           <w:i/>
         </w:rPr>
-        <w:t>All cost figures are indicative and should be validated with actual vendor quotes. Scenario B is the recommended starting point for BorderlessAccess given the strong internal domain expertise available in the research and operations teams.</w:t>
+        <w:t>All cost figures are indicative and should be validated with actual vendor quotes. Scenario B is the recommended starting point for Borderless</w:t>
+      </w:r>
+      <w:r>
+        <w:rPr>
+          <w:i/>
+        </w:rPr>
+        <w:t xml:space="preserve"> </w:t>
+      </w:r>
+      <w:r>
+        <w:rPr>
+          <w:i/>
+        </w:rPr>
+        <w:t>Access given the strong internal domain expertise available in the research and operations teams.</w:t>
       </w:r>
     </w:p>
     <w:sectPr>

</xml_diff>